<commit_message>
Refresh downloadable résumé PDF and DOCX
</commit_message>
<xml_diff>
--- a/public/resume/Yaneth-Castillo-GISP-Resume.docx
+++ b/public/resume/Yaneth-Castillo-GISP-Resume.docx
@@ -209,7 +209,7 @@
                 <w:color w:val="5D314F"/>
                 <w:sz w:val="17"/>
               </w:rPr>
-              <w:t>Feb 2024–Present</w:t>
+              <w:t>Jan 2024–Present</w:t>
             </w:r>
           </w:p>
         </w:tc>
@@ -224,11 +224,9 @@
         <w:rPr>
           <w:b/>
         </w:rPr>
-        <w:t xml:space="preserve">• </w:t>
+        <w:t>Deliver GIS solutions across transportation, utilities, land development, municipal planning, and regulatory projects, translating complex spatial requirements into reliable datasets, interactive applications, and client-facing deliverables.</w:t>
       </w:r>
-      <w:r>
-        <w:t>Develop GIS deliverables and public-facing mapping for land development, utilities, transportation, municipal planning, and regulatory work.</w:t>
-      </w:r>
+      <w:r/>
     </w:p>
     <w:p>
       <w:pPr>
@@ -239,11 +237,9 @@
         <w:rPr>
           <w:b/>
         </w:rPr>
-        <w:t xml:space="preserve">• </w:t>
+        <w:t>Reconstruct and validate complex legal boundaries from survey documentation, including a 224.109-acre tract defined by 109 metes-and-bounds courses, identifying a 0.65-acre discrepancy in reference data.</w:t>
       </w:r>
-      <w:r>
-        <w:t>Reconstructed a 224.109-acre service-area tract from 109 metes-and-bounds courses, matched the boundary survey acreage, and identified an approximately 0.65-acre discrepancy in a reference dataset.</w:t>
-      </w:r>
+      <w:r/>
     </w:p>
     <w:p>
       <w:pPr>
@@ -254,11 +250,9 @@
         <w:rPr>
           <w:b/>
         </w:rPr>
-        <w:t xml:space="preserve">• </w:t>
+        <w:t>Configure and enhance a public-facing Web GIS platform supporting 133 spatial layers, maintaining separate aerial and street-map configurations with structured layer hierarchies, interactive legends, and visibility controls.</w:t>
       </w:r>
-      <w:r>
-        <w:t>Adapted and extended JSON configurations for a custom 51-layer public Web GIS viewer, maintained separate aerial and street-map variants, and configured nested layer, legend, and visibility behavior with technical mentorship.</w:t>
-      </w:r>
+      <w:r/>
     </w:p>
     <w:p>
       <w:pPr>
@@ -269,11 +263,9 @@
         <w:rPr>
           <w:b/>
         </w:rPr>
-        <w:t xml:space="preserve">• </w:t>
+        <w:t>Develop and maintain ArcGIS Online and Experience Builder applications, incorporating hosted feature services, vector tile layers, Arcade expressions, and access controls to support internal and public-facing workflows.</w:t>
       </w:r>
-      <w:r>
-        <w:t>Build and maintain ArcGIS Online and Experience Builder applications using hosted feature layers, vector tiles, Arcade expressions, permissions, and documented handoffs.</w:t>
-      </w:r>
+      <w:r/>
     </w:p>
     <w:p>
       <w:pPr>
@@ -284,11 +276,9 @@
         <w:rPr>
           <w:b/>
         </w:rPr>
-        <w:t xml:space="preserve">• </w:t>
-      </w:r>
-      <w:r>
         <w:t>Create client-facing cartographic exhibits that synthesize municipal boundaries, precincts, ETJs, transportation, airports, channels, and imagery into clear visual narratives.</w:t>
       </w:r>
+      <w:r/>
     </w:p>
     <w:p>
       <w:pPr>

</xml_diff>